<commit_message>
update deliverable e manuale
</commit_message>
<xml_diff>
--- a/documents/Deliverables/KPI & FATs.docx
+++ b/documents/Deliverables/KPI & FATs.docx
@@ -33,12 +33,14 @@
         <w:rPr>
           <w:rFonts w:asciiTheme="minorHAnsi" w:hAnsiTheme="minorHAnsi" w:cstheme="minorHAnsi"/>
           <w:color w:val="000000" w:themeColor="text1"/>
+          <w:lang w:val="en-US"/>
         </w:rPr>
       </w:pPr>
       <w:r>
         <w:rPr>
           <w:rFonts w:asciiTheme="minorHAnsi" w:hAnsiTheme="minorHAnsi" w:cstheme="minorHAnsi"/>
           <w:color w:val="000000" w:themeColor="text1"/>
+          <w:lang w:val="en-US"/>
         </w:rPr>
         <w:t>Power Bank e USB-</w:t>
       </w:r>
@@ -47,6 +49,7 @@
         <w:rPr>
           <w:rFonts w:asciiTheme="minorHAnsi" w:hAnsiTheme="minorHAnsi" w:cstheme="minorHAnsi"/>
           <w:color w:val="000000" w:themeColor="text1"/>
+          <w:lang w:val="en-US"/>
         </w:rPr>
         <w:t>TypeC</w:t>
       </w:r>
@@ -55,6 +58,7 @@
         <w:rPr>
           <w:rFonts w:asciiTheme="minorHAnsi" w:hAnsiTheme="minorHAnsi" w:cstheme="minorHAnsi"/>
           <w:color w:val="000000" w:themeColor="text1"/>
+          <w:lang w:val="en-US"/>
         </w:rPr>
         <w:t xml:space="preserve"> Power Delivery Board (PDB)</w:t>
       </w:r>
@@ -118,6 +122,7 @@
           <w:numId w:val="21"/>
         </w:numPr>
         <w:spacing w:after="0"/>
+        <w:jc w:val="both"/>
         <w:rPr>
           <w:rFonts w:asciiTheme="minorHAnsi" w:hAnsiTheme="minorHAnsi" w:cstheme="minorHAnsi"/>
         </w:rPr>
@@ -2727,12 +2732,14 @@
               <w:rPr>
                 <w:rFonts w:asciiTheme="minorHAnsi" w:hAnsiTheme="minorHAnsi" w:cstheme="minorHAnsi"/>
                 <w:color w:val="000000" w:themeColor="text1"/>
+                <w:lang w:val="en-US"/>
               </w:rPr>
             </w:pPr>
             <w:r>
               <w:rPr>
                 <w:rFonts w:asciiTheme="minorHAnsi" w:hAnsiTheme="minorHAnsi" w:cstheme="minorHAnsi"/>
                 <w:color w:val="000000" w:themeColor="text1"/>
+                <w:lang w:val="en-US"/>
               </w:rPr>
               <w:t xml:space="preserve">1. Power bank </w:t>
             </w:r>
@@ -2740,6 +2747,7 @@
               <w:rPr>
                 <w:rFonts w:asciiTheme="minorHAnsi" w:hAnsiTheme="minorHAnsi" w:cstheme="minorHAnsi"/>
                 <w:color w:val="000000" w:themeColor="text1"/>
+                <w:lang w:val="en-US"/>
               </w:rPr>
               <w:t>e</w:t>
             </w:r>
@@ -2747,6 +2755,7 @@
               <w:rPr>
                 <w:rFonts w:asciiTheme="minorHAnsi" w:hAnsiTheme="minorHAnsi" w:cstheme="minorHAnsi"/>
                 <w:color w:val="000000" w:themeColor="text1"/>
+                <w:lang w:val="en-US"/>
               </w:rPr>
               <w:t xml:space="preserve"> USB-</w:t>
             </w:r>
@@ -2755,6 +2764,7 @@
               <w:rPr>
                 <w:rFonts w:asciiTheme="minorHAnsi" w:hAnsiTheme="minorHAnsi" w:cstheme="minorHAnsi"/>
                 <w:color w:val="000000" w:themeColor="text1"/>
+                <w:lang w:val="en-US"/>
               </w:rPr>
               <w:t>TypeC</w:t>
             </w:r>
@@ -2763,6 +2773,7 @@
               <w:rPr>
                 <w:rFonts w:asciiTheme="minorHAnsi" w:hAnsiTheme="minorHAnsi" w:cstheme="minorHAnsi"/>
                 <w:color w:val="000000" w:themeColor="text1"/>
+                <w:lang w:val="en-US"/>
               </w:rPr>
               <w:t xml:space="preserve"> PDB</w:t>
             </w:r>
@@ -3941,11 +3952,13 @@
         </w:numPr>
         <w:rPr>
           <w:rFonts w:asciiTheme="minorHAnsi" w:hAnsiTheme="minorHAnsi" w:cstheme="minorHAnsi"/>
-        </w:rPr>
-      </w:pPr>
-      <w:r>
-        <w:rPr>
-          <w:rFonts w:asciiTheme="minorHAnsi" w:hAnsiTheme="minorHAnsi" w:cstheme="minorHAnsi"/>
+          <w:lang w:val="en-US"/>
+        </w:rPr>
+      </w:pPr>
+      <w:r>
+        <w:rPr>
+          <w:rFonts w:asciiTheme="minorHAnsi" w:hAnsiTheme="minorHAnsi" w:cstheme="minorHAnsi"/>
+          <w:lang w:val="en-US"/>
         </w:rPr>
         <w:t>Hardware: Power Bank + USB-</w:t>
       </w:r>
@@ -3953,6 +3966,7 @@
       <w:r>
         <w:rPr>
           <w:rFonts w:asciiTheme="minorHAnsi" w:hAnsiTheme="minorHAnsi" w:cstheme="minorHAnsi"/>
+          <w:lang w:val="en-US"/>
         </w:rPr>
         <w:t>TypeC</w:t>
       </w:r>
@@ -3960,23 +3974,35 @@
       <w:r>
         <w:rPr>
           <w:rFonts w:asciiTheme="minorHAnsi" w:hAnsiTheme="minorHAnsi" w:cstheme="minorHAnsi"/>
-        </w:rPr>
-        <w:t xml:space="preserve"> PDB + </w:t>
+          <w:lang w:val="en-US"/>
+        </w:rPr>
+        <w:t xml:space="preserve"> PDB + Jetson TX2 + Tutti </w:t>
       </w:r>
       <w:proofErr w:type="spellStart"/>
       <w:r>
         <w:rPr>
           <w:rFonts w:asciiTheme="minorHAnsi" w:hAnsiTheme="minorHAnsi" w:cstheme="minorHAnsi"/>
-        </w:rPr>
-        <w:t>Jetson</w:t>
+          <w:lang w:val="en-US"/>
+        </w:rPr>
+        <w:t>i</w:t>
       </w:r>
       <w:proofErr w:type="spellEnd"/>
       <w:r>
         <w:rPr>
           <w:rFonts w:asciiTheme="minorHAnsi" w:hAnsiTheme="minorHAnsi" w:cstheme="minorHAnsi"/>
-        </w:rPr>
-        <w:t xml:space="preserve"> TX2 + Tutti i sensori</w:t>
-      </w:r>
+          <w:lang w:val="en-US"/>
+        </w:rPr>
+        <w:t xml:space="preserve"> </w:t>
+      </w:r>
+      <w:proofErr w:type="spellStart"/>
+      <w:r>
+        <w:rPr>
+          <w:rFonts w:asciiTheme="minorHAnsi" w:hAnsiTheme="minorHAnsi" w:cstheme="minorHAnsi"/>
+          <w:lang w:val="en-US"/>
+        </w:rPr>
+        <w:t>sensori</w:t>
+      </w:r>
+      <w:proofErr w:type="spellEnd"/>
     </w:p>
     <w:p>
       <w:pPr>
@@ -4847,36 +4873,16 @@
         </w:numPr>
         <w:rPr>
           <w:rFonts w:asciiTheme="minorHAnsi" w:hAnsiTheme="minorHAnsi" w:cstheme="minorHAnsi"/>
-        </w:rPr>
-      </w:pPr>
-      <w:r>
-        <w:rPr>
-          <w:rFonts w:asciiTheme="minorHAnsi" w:hAnsiTheme="minorHAnsi" w:cstheme="minorHAnsi"/>
-        </w:rPr>
-        <w:t xml:space="preserve">Hardware: </w:t>
-      </w:r>
-      <w:proofErr w:type="spellStart"/>
-      <w:r>
-        <w:rPr>
-          <w:rFonts w:asciiTheme="minorHAnsi" w:hAnsiTheme="minorHAnsi" w:cstheme="minorHAnsi"/>
-        </w:rPr>
-        <w:t>Jetson</w:t>
-      </w:r>
-      <w:proofErr w:type="spellEnd"/>
-      <w:r>
-        <w:rPr>
-          <w:rFonts w:asciiTheme="minorHAnsi" w:hAnsiTheme="minorHAnsi" w:cstheme="minorHAnsi"/>
-        </w:rPr>
-        <w:t xml:space="preserve"> TX2 + IMU X-</w:t>
-      </w:r>
-      <w:proofErr w:type="spellStart"/>
-      <w:r>
-        <w:rPr>
-          <w:rFonts w:asciiTheme="minorHAnsi" w:hAnsiTheme="minorHAnsi" w:cstheme="minorHAnsi"/>
-        </w:rPr>
-        <w:t>sense</w:t>
-      </w:r>
-      <w:proofErr w:type="spellEnd"/>
+          <w:lang w:val="en-US"/>
+        </w:rPr>
+      </w:pPr>
+      <w:r>
+        <w:rPr>
+          <w:rFonts w:asciiTheme="minorHAnsi" w:hAnsiTheme="minorHAnsi" w:cstheme="minorHAnsi"/>
+          <w:lang w:val="en-US"/>
+        </w:rPr>
+        <w:t>Hardware: Jetson TX2 + IMU X-sense</w:t>
+      </w:r>
     </w:p>
     <w:p>
       <w:pPr>
@@ -4887,11 +4893,13 @@
         </w:numPr>
         <w:rPr>
           <w:rFonts w:asciiTheme="minorHAnsi" w:hAnsiTheme="minorHAnsi" w:cstheme="minorHAnsi"/>
-        </w:rPr>
-      </w:pPr>
-      <w:r>
-        <w:rPr>
-          <w:rFonts w:asciiTheme="minorHAnsi" w:hAnsiTheme="minorHAnsi" w:cstheme="minorHAnsi"/>
+          <w:lang w:val="en-US"/>
+        </w:rPr>
+      </w:pPr>
+      <w:r>
+        <w:rPr>
+          <w:rFonts w:asciiTheme="minorHAnsi" w:hAnsiTheme="minorHAnsi" w:cstheme="minorHAnsi"/>
+          <w:lang w:val="en-US"/>
         </w:rPr>
         <w:t>Script: `mainKF_TX2_v0.py` (ENABLE_LOGGING = True)</w:t>
       </w:r>
@@ -5800,27 +5808,15 @@
         </w:numPr>
         <w:rPr>
           <w:rFonts w:asciiTheme="minorHAnsi" w:hAnsiTheme="minorHAnsi" w:cstheme="minorHAnsi"/>
-        </w:rPr>
-      </w:pPr>
-      <w:r>
-        <w:rPr>
-          <w:rFonts w:asciiTheme="minorHAnsi" w:hAnsiTheme="minorHAnsi" w:cstheme="minorHAnsi"/>
-        </w:rPr>
-        <w:t>Hardware: UM (Transponder) + Boa (</w:t>
-      </w:r>
-      <w:proofErr w:type="spellStart"/>
-      <w:r>
-        <w:rPr>
-          <w:rFonts w:asciiTheme="minorHAnsi" w:hAnsiTheme="minorHAnsi" w:cstheme="minorHAnsi"/>
-        </w:rPr>
-        <w:t>Transceiver</w:t>
-      </w:r>
-      <w:proofErr w:type="spellEnd"/>
-      <w:r>
-        <w:rPr>
-          <w:rFonts w:asciiTheme="minorHAnsi" w:hAnsiTheme="minorHAnsi" w:cstheme="minorHAnsi"/>
-        </w:rPr>
-        <w:t>)</w:t>
+          <w:lang w:val="en-US"/>
+        </w:rPr>
+      </w:pPr>
+      <w:r>
+        <w:rPr>
+          <w:rFonts w:asciiTheme="minorHAnsi" w:hAnsiTheme="minorHAnsi" w:cstheme="minorHAnsi"/>
+          <w:lang w:val="en-US"/>
+        </w:rPr>
+        <w:t>Hardware: UM (Transponder) + Boa (Transceiver)</w:t>
       </w:r>
     </w:p>
     <w:p>
@@ -5832,27 +5828,15 @@
         </w:numPr>
         <w:rPr>
           <w:rFonts w:asciiTheme="minorHAnsi" w:hAnsiTheme="minorHAnsi" w:cstheme="minorHAnsi"/>
-        </w:rPr>
-      </w:pPr>
-      <w:r>
-        <w:rPr>
-          <w:rFonts w:asciiTheme="minorHAnsi" w:hAnsiTheme="minorHAnsi" w:cstheme="minorHAnsi"/>
-        </w:rPr>
-        <w:t>Script UM: `</w:t>
-      </w:r>
-      <w:proofErr w:type="spellStart"/>
-      <w:r>
-        <w:rPr>
-          <w:rFonts w:asciiTheme="minorHAnsi" w:hAnsiTheme="minorHAnsi" w:cstheme="minorHAnsi"/>
-        </w:rPr>
-        <w:t>lib</w:t>
-      </w:r>
-      <w:proofErr w:type="spellEnd"/>
-      <w:r>
-        <w:rPr>
-          <w:rFonts w:asciiTheme="minorHAnsi" w:hAnsiTheme="minorHAnsi" w:cstheme="minorHAnsi"/>
-        </w:rPr>
-        <w:t>/USBL/usbl_transponder.py` via `mainKF_TX2_v0.py`</w:t>
+          <w:lang w:val="en-US"/>
+        </w:rPr>
+      </w:pPr>
+      <w:r>
+        <w:rPr>
+          <w:rFonts w:asciiTheme="minorHAnsi" w:hAnsiTheme="minorHAnsi" w:cstheme="minorHAnsi"/>
+          <w:lang w:val="en-US"/>
+        </w:rPr>
+        <w:t>Script UM: `lib/USBL/usbl_transponder.py` via `mainKF_TX2_v0.py`</w:t>
       </w:r>
     </w:p>
     <w:p>
@@ -5864,25 +5848,29 @@
         </w:numPr>
         <w:rPr>
           <w:rFonts w:asciiTheme="minorHAnsi" w:hAnsiTheme="minorHAnsi" w:cstheme="minorHAnsi"/>
-        </w:rPr>
-      </w:pPr>
-      <w:r>
-        <w:rPr>
-          <w:rFonts w:asciiTheme="minorHAnsi" w:hAnsiTheme="minorHAnsi" w:cstheme="minorHAnsi"/>
-        </w:rPr>
-        <w:t>Script Boa: `</w:t>
+          <w:lang w:val="en-US"/>
+        </w:rPr>
+      </w:pPr>
+      <w:r>
+        <w:rPr>
+          <w:rFonts w:asciiTheme="minorHAnsi" w:hAnsiTheme="minorHAnsi" w:cstheme="minorHAnsi"/>
+          <w:lang w:val="en-US"/>
+        </w:rPr>
+        <w:t>Script Boa: `tests/</w:t>
       </w:r>
       <w:proofErr w:type="spellStart"/>
       <w:r>
         <w:rPr>
           <w:rFonts w:asciiTheme="minorHAnsi" w:hAnsiTheme="minorHAnsi" w:cstheme="minorHAnsi"/>
-        </w:rPr>
-        <w:t>tests</w:t>
+          <w:lang w:val="en-US"/>
+        </w:rPr>
+        <w:t>Transciever</w:t>
       </w:r>
       <w:proofErr w:type="spellEnd"/>
       <w:r>
         <w:rPr>
           <w:rFonts w:asciiTheme="minorHAnsi" w:hAnsiTheme="minorHAnsi" w:cstheme="minorHAnsi"/>
+          <w:lang w:val="en-US"/>
         </w:rPr>
         <w:t>/</w:t>
       </w:r>
@@ -5890,15 +5878,17 @@
       <w:r>
         <w:rPr>
           <w:rFonts w:asciiTheme="minorHAnsi" w:hAnsiTheme="minorHAnsi" w:cstheme="minorHAnsi"/>
-        </w:rPr>
-        <w:t>Transciever</w:t>
+          <w:lang w:val="en-US"/>
+        </w:rPr>
+        <w:t>demo_boa</w:t>
       </w:r>
       <w:proofErr w:type="spellEnd"/>
       <w:r>
         <w:rPr>
           <w:rFonts w:asciiTheme="minorHAnsi" w:hAnsiTheme="minorHAnsi" w:cstheme="minorHAnsi"/>
-        </w:rPr>
-        <w:t>/position_tracker_v5.py`</w:t>
+          <w:lang w:val="en-US"/>
+        </w:rPr>
+        <w:t>`</w:t>
       </w:r>
     </w:p>
     <w:p>
@@ -5967,7 +5957,21 @@
         <w:rPr>
           <w:rFonts w:asciiTheme="minorHAnsi" w:hAnsiTheme="minorHAnsi" w:cstheme="minorHAnsi"/>
         </w:rPr>
-        <w:t>Sulla Boa: `python3 position_tracker_v5.py`</w:t>
+        <w:t xml:space="preserve">Sulla Boa: `python3 </w:t>
+      </w:r>
+      <w:proofErr w:type="spellStart"/>
+      <w:r>
+        <w:rPr>
+          <w:rFonts w:asciiTheme="minorHAnsi" w:hAnsiTheme="minorHAnsi" w:cstheme="minorHAnsi"/>
+        </w:rPr>
+        <w:t>demo_boa</w:t>
+      </w:r>
+      <w:proofErr w:type="spellEnd"/>
+      <w:r>
+        <w:rPr>
+          <w:rFonts w:asciiTheme="minorHAnsi" w:hAnsiTheme="minorHAnsi" w:cstheme="minorHAnsi"/>
+        </w:rPr>
+        <w:t>`</w:t>
       </w:r>
     </w:p>
     <w:p>
@@ -6344,27 +6348,15 @@
         </w:numPr>
         <w:rPr>
           <w:rFonts w:asciiTheme="minorHAnsi" w:hAnsiTheme="minorHAnsi" w:cstheme="minorHAnsi"/>
-        </w:rPr>
-      </w:pPr>
-      <w:r>
-        <w:rPr>
-          <w:rFonts w:asciiTheme="minorHAnsi" w:hAnsiTheme="minorHAnsi" w:cstheme="minorHAnsi"/>
-        </w:rPr>
-        <w:t>Hardware: UM (Transponder) + Boa (</w:t>
-      </w:r>
-      <w:proofErr w:type="spellStart"/>
-      <w:r>
-        <w:rPr>
-          <w:rFonts w:asciiTheme="minorHAnsi" w:hAnsiTheme="minorHAnsi" w:cstheme="minorHAnsi"/>
-        </w:rPr>
-        <w:t>Transceiver</w:t>
-      </w:r>
-      <w:proofErr w:type="spellEnd"/>
-      <w:r>
-        <w:rPr>
-          <w:rFonts w:asciiTheme="minorHAnsi" w:hAnsiTheme="minorHAnsi" w:cstheme="minorHAnsi"/>
-        </w:rPr>
-        <w:t>)</w:t>
+          <w:lang w:val="en-US"/>
+        </w:rPr>
+      </w:pPr>
+      <w:r>
+        <w:rPr>
+          <w:rFonts w:asciiTheme="minorHAnsi" w:hAnsiTheme="minorHAnsi" w:cstheme="minorHAnsi"/>
+          <w:lang w:val="en-US"/>
+        </w:rPr>
+        <w:t>Hardware: UM (Transponder) + Boa (Transceiver)</w:t>
       </w:r>
     </w:p>
     <w:p>
@@ -6376,27 +6368,15 @@
         </w:numPr>
         <w:rPr>
           <w:rFonts w:asciiTheme="minorHAnsi" w:hAnsiTheme="minorHAnsi" w:cstheme="minorHAnsi"/>
-        </w:rPr>
-      </w:pPr>
-      <w:r>
-        <w:rPr>
-          <w:rFonts w:asciiTheme="minorHAnsi" w:hAnsiTheme="minorHAnsi" w:cstheme="minorHAnsi"/>
-        </w:rPr>
-        <w:t>Script UM: `</w:t>
-      </w:r>
-      <w:proofErr w:type="spellStart"/>
-      <w:r>
-        <w:rPr>
-          <w:rFonts w:asciiTheme="minorHAnsi" w:hAnsiTheme="minorHAnsi" w:cstheme="minorHAnsi"/>
-        </w:rPr>
-        <w:t>tests</w:t>
-      </w:r>
-      <w:proofErr w:type="spellEnd"/>
-      <w:r>
-        <w:rPr>
-          <w:rFonts w:asciiTheme="minorHAnsi" w:hAnsiTheme="minorHAnsi" w:cstheme="minorHAnsi"/>
-        </w:rPr>
-        <w:t>/Transponder/transponder_listener.py`</w:t>
+          <w:lang w:val="en-US"/>
+        </w:rPr>
+      </w:pPr>
+      <w:r>
+        <w:rPr>
+          <w:rFonts w:asciiTheme="minorHAnsi" w:hAnsiTheme="minorHAnsi" w:cstheme="minorHAnsi"/>
+          <w:lang w:val="en-US"/>
+        </w:rPr>
+        <w:t>Script UM: `tests/Transponder/transponder_listener.py`</w:t>
       </w:r>
     </w:p>
     <w:p>
@@ -6408,25 +6388,29 @@
         </w:numPr>
         <w:rPr>
           <w:rFonts w:asciiTheme="minorHAnsi" w:hAnsiTheme="minorHAnsi" w:cstheme="minorHAnsi"/>
-        </w:rPr>
-      </w:pPr>
-      <w:r>
-        <w:rPr>
-          <w:rFonts w:asciiTheme="minorHAnsi" w:hAnsiTheme="minorHAnsi" w:cstheme="minorHAnsi"/>
-        </w:rPr>
-        <w:t>Script Boa: `</w:t>
+          <w:lang w:val="en-US"/>
+        </w:rPr>
+      </w:pPr>
+      <w:r>
+        <w:rPr>
+          <w:rFonts w:asciiTheme="minorHAnsi" w:hAnsiTheme="minorHAnsi" w:cstheme="minorHAnsi"/>
+          <w:lang w:val="en-US"/>
+        </w:rPr>
+        <w:t>Script Boa: `tests/</w:t>
       </w:r>
       <w:proofErr w:type="spellStart"/>
       <w:r>
         <w:rPr>
           <w:rFonts w:asciiTheme="minorHAnsi" w:hAnsiTheme="minorHAnsi" w:cstheme="minorHAnsi"/>
-        </w:rPr>
-        <w:t>tests</w:t>
+          <w:lang w:val="en-US"/>
+        </w:rPr>
+        <w:t>Transciever</w:t>
       </w:r>
       <w:proofErr w:type="spellEnd"/>
       <w:r>
         <w:rPr>
           <w:rFonts w:asciiTheme="minorHAnsi" w:hAnsiTheme="minorHAnsi" w:cstheme="minorHAnsi"/>
+          <w:lang w:val="en-US"/>
         </w:rPr>
         <w:t>/</w:t>
       </w:r>
@@ -6434,15 +6418,17 @@
       <w:r>
         <w:rPr>
           <w:rFonts w:asciiTheme="minorHAnsi" w:hAnsiTheme="minorHAnsi" w:cstheme="minorHAnsi"/>
-        </w:rPr>
-        <w:t>Transciever</w:t>
+          <w:lang w:val="en-US"/>
+        </w:rPr>
+        <w:t>demo_boa</w:t>
       </w:r>
       <w:proofErr w:type="spellEnd"/>
       <w:r>
         <w:rPr>
           <w:rFonts w:asciiTheme="minorHAnsi" w:hAnsiTheme="minorHAnsi" w:cstheme="minorHAnsi"/>
-        </w:rPr>
-        <w:t>/position_tracker_v5.py`</w:t>
+          <w:lang w:val="en-US"/>
+        </w:rPr>
+        <w:t>`</w:t>
       </w:r>
     </w:p>
     <w:p>
@@ -6512,7 +6498,21 @@
         <w:rPr>
           <w:rFonts w:asciiTheme="minorHAnsi" w:hAnsiTheme="minorHAnsi" w:cstheme="minorHAnsi"/>
         </w:rPr>
-        <w:t>Sulla Boa: Inviare 500 messaggi via `position_tracker_v5.py`</w:t>
+        <w:t>Sulla Boa: Inviare 500 messaggi via `</w:t>
+      </w:r>
+      <w:proofErr w:type="spellStart"/>
+      <w:r>
+        <w:rPr>
+          <w:rFonts w:asciiTheme="minorHAnsi" w:hAnsiTheme="minorHAnsi" w:cstheme="minorHAnsi"/>
+        </w:rPr>
+        <w:t>demo_boa</w:t>
+      </w:r>
+      <w:proofErr w:type="spellEnd"/>
+      <w:r>
+        <w:rPr>
+          <w:rFonts w:asciiTheme="minorHAnsi" w:hAnsiTheme="minorHAnsi" w:cstheme="minorHAnsi"/>
+        </w:rPr>
+        <w:t>`</w:t>
       </w:r>
     </w:p>
     <w:p>
@@ -6917,27 +6917,15 @@
         </w:numPr>
         <w:rPr>
           <w:rFonts w:asciiTheme="minorHAnsi" w:hAnsiTheme="minorHAnsi" w:cstheme="minorHAnsi"/>
-        </w:rPr>
-      </w:pPr>
-      <w:r>
-        <w:rPr>
-          <w:rFonts w:asciiTheme="minorHAnsi" w:hAnsiTheme="minorHAnsi" w:cstheme="minorHAnsi"/>
-        </w:rPr>
-        <w:t>Hardware: UM (Transponder) + Boa (</w:t>
-      </w:r>
-      <w:proofErr w:type="spellStart"/>
-      <w:r>
-        <w:rPr>
-          <w:rFonts w:asciiTheme="minorHAnsi" w:hAnsiTheme="minorHAnsi" w:cstheme="minorHAnsi"/>
-        </w:rPr>
-        <w:t>Transceiver</w:t>
-      </w:r>
-      <w:proofErr w:type="spellEnd"/>
-      <w:r>
-        <w:rPr>
-          <w:rFonts w:asciiTheme="minorHAnsi" w:hAnsiTheme="minorHAnsi" w:cstheme="minorHAnsi"/>
-        </w:rPr>
-        <w:t>)</w:t>
+          <w:lang w:val="en-US"/>
+        </w:rPr>
+      </w:pPr>
+      <w:r>
+        <w:rPr>
+          <w:rFonts w:asciiTheme="minorHAnsi" w:hAnsiTheme="minorHAnsi" w:cstheme="minorHAnsi"/>
+          <w:lang w:val="en-US"/>
+        </w:rPr>
+        <w:t>Hardware: UM (Transponder) + Boa (Transceiver)</w:t>
       </w:r>
     </w:p>
     <w:p>
@@ -6949,27 +6937,15 @@
         </w:numPr>
         <w:rPr>
           <w:rFonts w:asciiTheme="minorHAnsi" w:hAnsiTheme="minorHAnsi" w:cstheme="minorHAnsi"/>
-        </w:rPr>
-      </w:pPr>
-      <w:r>
-        <w:rPr>
-          <w:rFonts w:asciiTheme="minorHAnsi" w:hAnsiTheme="minorHAnsi" w:cstheme="minorHAnsi"/>
-        </w:rPr>
-        <w:t xml:space="preserve">Script: `mainKF_TX2_v0.py` con </w:t>
-      </w:r>
-      <w:proofErr w:type="spellStart"/>
-      <w:r>
-        <w:rPr>
-          <w:rFonts w:asciiTheme="minorHAnsi" w:hAnsiTheme="minorHAnsi" w:cstheme="minorHAnsi"/>
-        </w:rPr>
-        <w:t>logging</w:t>
-      </w:r>
-      <w:proofErr w:type="spellEnd"/>
-      <w:r>
-        <w:rPr>
-          <w:rFonts w:asciiTheme="minorHAnsi" w:hAnsiTheme="minorHAnsi" w:cstheme="minorHAnsi"/>
-        </w:rPr>
-        <w:t xml:space="preserve"> USBL</w:t>
+          <w:lang w:val="en-US"/>
+        </w:rPr>
+      </w:pPr>
+      <w:r>
+        <w:rPr>
+          <w:rFonts w:asciiTheme="minorHAnsi" w:hAnsiTheme="minorHAnsi" w:cstheme="minorHAnsi"/>
+          <w:lang w:val="en-US"/>
+        </w:rPr>
+        <w:t>Script: `mainKF_TX2_v0.py` con logging USBL</w:t>
       </w:r>
     </w:p>
     <w:p>
@@ -7017,11 +6993,13 @@
         </w:numPr>
         <w:rPr>
           <w:rFonts w:asciiTheme="minorHAnsi" w:hAnsiTheme="minorHAnsi" w:cstheme="minorHAnsi"/>
-        </w:rPr>
-      </w:pPr>
-      <w:r>
-        <w:rPr>
-          <w:rFonts w:asciiTheme="minorHAnsi" w:hAnsiTheme="minorHAnsi" w:cstheme="minorHAnsi"/>
+          <w:lang w:val="en-US"/>
+        </w:rPr>
+      </w:pPr>
+      <w:r>
+        <w:rPr>
+          <w:rFonts w:asciiTheme="minorHAnsi" w:hAnsiTheme="minorHAnsi" w:cstheme="minorHAnsi"/>
+          <w:lang w:val="en-US"/>
         </w:rPr>
         <w:t>File Output: `</w:t>
       </w:r>
@@ -7029,6 +7007,7 @@
       <w:r>
         <w:rPr>
           <w:rFonts w:asciiTheme="minorHAnsi" w:hAnsiTheme="minorHAnsi" w:cstheme="minorHAnsi"/>
+          <w:lang w:val="en-US"/>
         </w:rPr>
         <w:t>sensor_logs</w:t>
       </w:r>
@@ -7036,6 +7015,7 @@
       <w:r>
         <w:rPr>
           <w:rFonts w:asciiTheme="minorHAnsi" w:hAnsiTheme="minorHAnsi" w:cstheme="minorHAnsi"/>
+          <w:lang w:val="en-US"/>
         </w:rPr>
         <w:t>/usbl_.csv`</w:t>
       </w:r>
@@ -7216,12 +7196,14 @@
         </w:numPr>
         <w:rPr>
           <w:rFonts w:asciiTheme="minorHAnsi" w:hAnsiTheme="minorHAnsi" w:cstheme="minorHAnsi"/>
+          <w:lang w:val="en-US"/>
         </w:rPr>
       </w:pPr>
       <w:proofErr w:type="spellStart"/>
       <w:r>
         <w:rPr>
           <w:rFonts w:asciiTheme="minorHAnsi" w:hAnsiTheme="minorHAnsi" w:cstheme="minorHAnsi"/>
+          <w:lang w:val="en-US"/>
         </w:rPr>
         <w:t>Fix_Validi</w:t>
       </w:r>
@@ -7229,36 +7211,34 @@
       <w:r>
         <w:rPr>
           <w:rFonts w:asciiTheme="minorHAnsi" w:hAnsiTheme="minorHAnsi" w:cstheme="minorHAnsi"/>
+          <w:lang w:val="en-US"/>
         </w:rPr>
         <w:t xml:space="preserve"> = </w:t>
       </w:r>
+      <w:proofErr w:type="gramStart"/>
+      <w:r>
+        <w:rPr>
+          <w:rFonts w:asciiTheme="minorHAnsi" w:hAnsiTheme="minorHAnsi" w:cstheme="minorHAnsi"/>
+          <w:lang w:val="en-US"/>
+        </w:rPr>
+        <w:t>count(</w:t>
+      </w:r>
       <w:proofErr w:type="spellStart"/>
-      <w:r>
-        <w:rPr>
-          <w:rFonts w:asciiTheme="minorHAnsi" w:hAnsiTheme="minorHAnsi" w:cstheme="minorHAnsi"/>
-        </w:rPr>
-        <w:t>count</w:t>
+      <w:proofErr w:type="gramEnd"/>
+      <w:r>
+        <w:rPr>
+          <w:rFonts w:asciiTheme="minorHAnsi" w:hAnsiTheme="minorHAnsi" w:cstheme="minorHAnsi"/>
+          <w:lang w:val="en-US"/>
+        </w:rPr>
+        <w:t>righe</w:t>
       </w:r>
       <w:proofErr w:type="spellEnd"/>
       <w:r>
         <w:rPr>
           <w:rFonts w:asciiTheme="minorHAnsi" w:hAnsiTheme="minorHAnsi" w:cstheme="minorHAnsi"/>
-        </w:rPr>
-        <w:t xml:space="preserve">(righe dove range_3d &gt; 0 AND </w:t>
-      </w:r>
-      <w:proofErr w:type="spellStart"/>
-      <w:r>
-        <w:rPr>
-          <w:rFonts w:asciiTheme="minorHAnsi" w:hAnsiTheme="minorHAnsi" w:cstheme="minorHAnsi"/>
-        </w:rPr>
-        <w:t>integrity</w:t>
-      </w:r>
-      <w:proofErr w:type="spellEnd"/>
-      <w:r>
-        <w:rPr>
-          <w:rFonts w:asciiTheme="minorHAnsi" w:hAnsiTheme="minorHAnsi" w:cstheme="minorHAnsi"/>
-        </w:rPr>
-        <w:t xml:space="preserve"> &gt;= 50)</w:t>
+          <w:lang w:val="en-US"/>
+        </w:rPr>
+        <w:t xml:space="preserve"> dove range_3d &gt; 0 AND integrity &gt;= 50)</w:t>
       </w:r>
     </w:p>
     <w:p>
@@ -7270,12 +7250,14 @@
         </w:numPr>
         <w:rPr>
           <w:rFonts w:asciiTheme="minorHAnsi" w:hAnsiTheme="minorHAnsi" w:cstheme="minorHAnsi"/>
+          <w:lang w:val="en-US"/>
         </w:rPr>
       </w:pPr>
       <w:proofErr w:type="spellStart"/>
       <w:r>
         <w:rPr>
           <w:rFonts w:asciiTheme="minorHAnsi" w:hAnsiTheme="minorHAnsi" w:cstheme="minorHAnsi"/>
+          <w:lang w:val="en-US"/>
         </w:rPr>
         <w:t>USBLANGLES_Loss</w:t>
       </w:r>
@@ -7283,6 +7265,7 @@
       <w:r>
         <w:rPr>
           <w:rFonts w:asciiTheme="minorHAnsi" w:hAnsiTheme="minorHAnsi" w:cstheme="minorHAnsi"/>
+          <w:lang w:val="en-US"/>
         </w:rPr>
         <w:t xml:space="preserve"> = (1 - </w:t>
       </w:r>
@@ -7290,6 +7273,7 @@
       <w:r>
         <w:rPr>
           <w:rFonts w:asciiTheme="minorHAnsi" w:hAnsiTheme="minorHAnsi" w:cstheme="minorHAnsi"/>
+          <w:lang w:val="en-US"/>
         </w:rPr>
         <w:t>Fix_Validi</w:t>
       </w:r>
@@ -7297,6 +7281,7 @@
       <w:r>
         <w:rPr>
           <w:rFonts w:asciiTheme="minorHAnsi" w:hAnsiTheme="minorHAnsi" w:cstheme="minorHAnsi"/>
+          <w:lang w:val="en-US"/>
         </w:rPr>
         <w:t xml:space="preserve"> / </w:t>
       </w:r>
@@ -7304,6 +7289,7 @@
       <w:r>
         <w:rPr>
           <w:rFonts w:asciiTheme="minorHAnsi" w:hAnsiTheme="minorHAnsi" w:cstheme="minorHAnsi"/>
+          <w:lang w:val="en-US"/>
         </w:rPr>
         <w:t>Fix_Attesi</w:t>
       </w:r>
@@ -7311,6 +7297,7 @@
       <w:r>
         <w:rPr>
           <w:rFonts w:asciiTheme="minorHAnsi" w:hAnsiTheme="minorHAnsi" w:cstheme="minorHAnsi"/>
+          <w:lang w:val="en-US"/>
         </w:rPr>
         <w:t>) × 100%</w:t>
       </w:r>
@@ -7319,6 +7306,7 @@
       <w:pPr>
         <w:rPr>
           <w:rFonts w:asciiTheme="minorHAnsi" w:hAnsiTheme="minorHAnsi" w:cstheme="minorHAnsi"/>
+          <w:lang w:val="en-US"/>
         </w:rPr>
       </w:pPr>
     </w:p>
@@ -7462,27 +7450,15 @@
         </w:numPr>
         <w:rPr>
           <w:rFonts w:asciiTheme="minorHAnsi" w:hAnsiTheme="minorHAnsi" w:cstheme="minorHAnsi"/>
-        </w:rPr>
-      </w:pPr>
-      <w:r>
-        <w:rPr>
-          <w:rFonts w:asciiTheme="minorHAnsi" w:hAnsiTheme="minorHAnsi" w:cstheme="minorHAnsi"/>
-        </w:rPr>
-        <w:t>Hardware: UM (Transponder) + Boa (</w:t>
-      </w:r>
-      <w:proofErr w:type="spellStart"/>
-      <w:r>
-        <w:rPr>
-          <w:rFonts w:asciiTheme="minorHAnsi" w:hAnsiTheme="minorHAnsi" w:cstheme="minorHAnsi"/>
-        </w:rPr>
-        <w:t>Transceiver</w:t>
-      </w:r>
-      <w:proofErr w:type="spellEnd"/>
-      <w:r>
-        <w:rPr>
-          <w:rFonts w:asciiTheme="minorHAnsi" w:hAnsiTheme="minorHAnsi" w:cstheme="minorHAnsi"/>
-        </w:rPr>
-        <w:t>)</w:t>
+          <w:lang w:val="en-US"/>
+        </w:rPr>
+      </w:pPr>
+      <w:r>
+        <w:rPr>
+          <w:rFonts w:asciiTheme="minorHAnsi" w:hAnsiTheme="minorHAnsi" w:cstheme="minorHAnsi"/>
+          <w:lang w:val="en-US"/>
+        </w:rPr>
+        <w:t>Hardware: UM (Transponder) + Boa (Transceiver)</w:t>
       </w:r>
     </w:p>
     <w:p>
@@ -7494,27 +7470,15 @@
         </w:numPr>
         <w:rPr>
           <w:rFonts w:asciiTheme="minorHAnsi" w:hAnsiTheme="minorHAnsi" w:cstheme="minorHAnsi"/>
-        </w:rPr>
-      </w:pPr>
-      <w:r>
-        <w:rPr>
-          <w:rFonts w:asciiTheme="minorHAnsi" w:hAnsiTheme="minorHAnsi" w:cstheme="minorHAnsi"/>
-        </w:rPr>
-        <w:t xml:space="preserve">Script: `mainKF_TX2_v0.py` con </w:t>
-      </w:r>
-      <w:proofErr w:type="spellStart"/>
-      <w:r>
-        <w:rPr>
-          <w:rFonts w:asciiTheme="minorHAnsi" w:hAnsiTheme="minorHAnsi" w:cstheme="minorHAnsi"/>
-        </w:rPr>
-        <w:t>logging</w:t>
-      </w:r>
-      <w:proofErr w:type="spellEnd"/>
-      <w:r>
-        <w:rPr>
-          <w:rFonts w:asciiTheme="minorHAnsi" w:hAnsiTheme="minorHAnsi" w:cstheme="minorHAnsi"/>
-        </w:rPr>
-        <w:t xml:space="preserve"> USBL</w:t>
+          <w:lang w:val="en-US"/>
+        </w:rPr>
+      </w:pPr>
+      <w:r>
+        <w:rPr>
+          <w:rFonts w:asciiTheme="minorHAnsi" w:hAnsiTheme="minorHAnsi" w:cstheme="minorHAnsi"/>
+          <w:lang w:val="en-US"/>
+        </w:rPr>
+        <w:t>Script: `mainKF_TX2_v0.py` con logging USBL</w:t>
       </w:r>
     </w:p>
     <w:p>
@@ -7544,11 +7508,13 @@
         </w:numPr>
         <w:rPr>
           <w:rFonts w:asciiTheme="minorHAnsi" w:hAnsiTheme="minorHAnsi" w:cstheme="minorHAnsi"/>
-        </w:rPr>
-      </w:pPr>
-      <w:r>
-        <w:rPr>
-          <w:rFonts w:asciiTheme="minorHAnsi" w:hAnsiTheme="minorHAnsi" w:cstheme="minorHAnsi"/>
+          <w:lang w:val="en-US"/>
+        </w:rPr>
+      </w:pPr>
+      <w:r>
+        <w:rPr>
+          <w:rFonts w:asciiTheme="minorHAnsi" w:hAnsiTheme="minorHAnsi" w:cstheme="minorHAnsi"/>
+          <w:lang w:val="en-US"/>
         </w:rPr>
         <w:t>File Output: `</w:t>
       </w:r>
@@ -7556,6 +7522,7 @@
       <w:r>
         <w:rPr>
           <w:rFonts w:asciiTheme="minorHAnsi" w:hAnsiTheme="minorHAnsi" w:cstheme="minorHAnsi"/>
+          <w:lang w:val="en-US"/>
         </w:rPr>
         <w:t>sensor_logs</w:t>
       </w:r>
@@ -7563,6 +7530,7 @@
       <w:r>
         <w:rPr>
           <w:rFonts w:asciiTheme="minorHAnsi" w:hAnsiTheme="minorHAnsi" w:cstheme="minorHAnsi"/>
+          <w:lang w:val="en-US"/>
         </w:rPr>
         <w:t>/usbl_.csv`</w:t>
       </w:r>
@@ -7576,47 +7544,31 @@
         </w:numPr>
         <w:rPr>
           <w:rFonts w:asciiTheme="minorHAnsi" w:hAnsiTheme="minorHAnsi" w:cstheme="minorHAnsi"/>
-        </w:rPr>
-      </w:pPr>
-      <w:r>
-        <w:rPr>
-          <w:rFonts w:asciiTheme="minorHAnsi" w:hAnsiTheme="minorHAnsi" w:cstheme="minorHAnsi"/>
-        </w:rPr>
-        <w:t xml:space="preserve">Colonne: </w:t>
-      </w:r>
+          <w:lang w:val="en-US"/>
+        </w:rPr>
+      </w:pPr>
       <w:proofErr w:type="spellStart"/>
       <w:r>
         <w:rPr>
           <w:rFonts w:asciiTheme="minorHAnsi" w:hAnsiTheme="minorHAnsi" w:cstheme="minorHAnsi"/>
-        </w:rPr>
-        <w:t>east</w:t>
+          <w:lang w:val="en-US"/>
+        </w:rPr>
+        <w:t>Colonne</w:t>
       </w:r>
       <w:proofErr w:type="spellEnd"/>
       <w:r>
         <w:rPr>
           <w:rFonts w:asciiTheme="minorHAnsi" w:hAnsiTheme="minorHAnsi" w:cstheme="minorHAnsi"/>
-        </w:rPr>
-        <w:t xml:space="preserve">, </w:t>
-      </w:r>
-      <w:proofErr w:type="spellStart"/>
-      <w:r>
-        <w:rPr>
-          <w:rFonts w:asciiTheme="minorHAnsi" w:hAnsiTheme="minorHAnsi" w:cstheme="minorHAnsi"/>
-        </w:rPr>
-        <w:t>north</w:t>
-      </w:r>
-      <w:proofErr w:type="spellEnd"/>
-      <w:r>
-        <w:rPr>
-          <w:rFonts w:asciiTheme="minorHAnsi" w:hAnsiTheme="minorHAnsi" w:cstheme="minorHAnsi"/>
-        </w:rPr>
-        <w:t>, up, range, mode</w:t>
-      </w:r>
-    </w:p>
-    <w:p>
-      <w:pPr>
-        <w:rPr>
-          <w:rFonts w:asciiTheme="minorHAnsi" w:hAnsiTheme="minorHAnsi" w:cstheme="minorHAnsi"/>
+          <w:lang w:val="en-US"/>
+        </w:rPr>
+        <w:t>: east, north, up, range, mode</w:t>
+      </w:r>
+    </w:p>
+    <w:p>
+      <w:pPr>
+        <w:rPr>
+          <w:rFonts w:asciiTheme="minorHAnsi" w:hAnsiTheme="minorHAnsi" w:cstheme="minorHAnsi"/>
+          <w:lang w:val="en-US"/>
         </w:rPr>
       </w:pPr>
     </w:p>
@@ -7680,35 +7632,31 @@
         </w:numPr>
         <w:rPr>
           <w:rFonts w:asciiTheme="minorHAnsi" w:hAnsiTheme="minorHAnsi" w:cstheme="minorHAnsi"/>
-        </w:rPr>
-      </w:pPr>
+          <w:lang w:val="en-US"/>
+        </w:rPr>
+      </w:pPr>
+      <w:r>
+        <w:rPr>
+          <w:rFonts w:asciiTheme="minorHAnsi" w:hAnsiTheme="minorHAnsi" w:cstheme="minorHAnsi"/>
+          <w:lang w:val="en-US"/>
+        </w:rPr>
+        <w:t>east, north, up (</w:t>
+      </w:r>
       <w:proofErr w:type="spellStart"/>
       <w:r>
         <w:rPr>
           <w:rFonts w:asciiTheme="minorHAnsi" w:hAnsiTheme="minorHAnsi" w:cstheme="minorHAnsi"/>
-        </w:rPr>
-        <w:t>east</w:t>
+          <w:lang w:val="en-US"/>
+        </w:rPr>
+        <w:t>modalità</w:t>
       </w:r>
       <w:proofErr w:type="spellEnd"/>
       <w:r>
         <w:rPr>
           <w:rFonts w:asciiTheme="minorHAnsi" w:hAnsiTheme="minorHAnsi" w:cstheme="minorHAnsi"/>
-        </w:rPr>
-        <w:t xml:space="preserve">, </w:t>
-      </w:r>
-      <w:proofErr w:type="spellStart"/>
-      <w:r>
-        <w:rPr>
-          <w:rFonts w:asciiTheme="minorHAnsi" w:hAnsiTheme="minorHAnsi" w:cstheme="minorHAnsi"/>
-        </w:rPr>
-        <w:t>north</w:t>
-      </w:r>
-      <w:proofErr w:type="spellEnd"/>
-      <w:r>
-        <w:rPr>
-          <w:rFonts w:asciiTheme="minorHAnsi" w:hAnsiTheme="minorHAnsi" w:cstheme="minorHAnsi"/>
-        </w:rPr>
-        <w:t>, up (modalità USBLANGLES)</w:t>
+          <w:lang w:val="en-US"/>
+        </w:rPr>
+        <w:t xml:space="preserve"> USBLANGLES)</w:t>
       </w:r>
     </w:p>
     <w:p>
@@ -7720,13 +7668,31 @@
         </w:numPr>
         <w:rPr>
           <w:rFonts w:asciiTheme="minorHAnsi" w:hAnsiTheme="minorHAnsi" w:cstheme="minorHAnsi"/>
-        </w:rPr>
-      </w:pPr>
-      <w:r>
-        <w:rPr>
-          <w:rFonts w:asciiTheme="minorHAnsi" w:hAnsiTheme="minorHAnsi" w:cstheme="minorHAnsi"/>
-        </w:rPr>
-        <w:t>range, range_3d (modalità USBLLONG)</w:t>
+          <w:lang w:val="en-US"/>
+        </w:rPr>
+      </w:pPr>
+      <w:r>
+        <w:rPr>
+          <w:rFonts w:asciiTheme="minorHAnsi" w:hAnsiTheme="minorHAnsi" w:cstheme="minorHAnsi"/>
+          <w:lang w:val="en-US"/>
+        </w:rPr>
+        <w:t>range, range_3d (</w:t>
+      </w:r>
+      <w:proofErr w:type="spellStart"/>
+      <w:r>
+        <w:rPr>
+          <w:rFonts w:asciiTheme="minorHAnsi" w:hAnsiTheme="minorHAnsi" w:cstheme="minorHAnsi"/>
+          <w:lang w:val="en-US"/>
+        </w:rPr>
+        <w:t>modalità</w:t>
+      </w:r>
+      <w:proofErr w:type="spellEnd"/>
+      <w:r>
+        <w:rPr>
+          <w:rFonts w:asciiTheme="minorHAnsi" w:hAnsiTheme="minorHAnsi" w:cstheme="minorHAnsi"/>
+          <w:lang w:val="en-US"/>
+        </w:rPr>
+        <w:t xml:space="preserve"> USBLLONG)</w:t>
       </w:r>
     </w:p>
     <w:p>
@@ -7824,6 +7790,7 @@
       <w:r>
         <w:rPr>
           <w:rFonts w:asciiTheme="minorHAnsi" w:hAnsiTheme="minorHAnsi" w:cstheme="minorHAnsi"/>
+          <w:lang w:val="en-US"/>
         </w:rPr>
         <w:t>USBLLONG_Validi</w:t>
       </w:r>
@@ -7831,22 +7798,56 @@
       <w:r>
         <w:rPr>
           <w:rFonts w:asciiTheme="minorHAnsi" w:hAnsiTheme="minorHAnsi" w:cstheme="minorHAnsi"/>
+          <w:lang w:val="en-US"/>
         </w:rPr>
         <w:t xml:space="preserve"> = </w:t>
       </w:r>
+      <w:proofErr w:type="gramStart"/>
+      <w:r>
+        <w:rPr>
+          <w:rFonts w:asciiTheme="minorHAnsi" w:hAnsiTheme="minorHAnsi" w:cstheme="minorHAnsi"/>
+          <w:lang w:val="en-US"/>
+        </w:rPr>
+        <w:t>count(</w:t>
+      </w:r>
       <w:proofErr w:type="spellStart"/>
-      <w:r>
-        <w:rPr>
-          <w:rFonts w:asciiTheme="minorHAnsi" w:hAnsiTheme="minorHAnsi" w:cstheme="minorHAnsi"/>
-        </w:rPr>
-        <w:t>count</w:t>
+      <w:proofErr w:type="gramEnd"/>
+      <w:r>
+        <w:rPr>
+          <w:rFonts w:asciiTheme="minorHAnsi" w:hAnsiTheme="minorHAnsi" w:cstheme="minorHAnsi"/>
+          <w:lang w:val="en-US"/>
+        </w:rPr>
+        <w:t>righe</w:t>
       </w:r>
       <w:proofErr w:type="spellEnd"/>
       <w:r>
         <w:rPr>
           <w:rFonts w:asciiTheme="minorHAnsi" w:hAnsiTheme="minorHAnsi" w:cstheme="minorHAnsi"/>
-        </w:rPr>
-        <w:t>(righe dove range &gt; 0 AND mode != 'NONE')</w:t>
+          <w:lang w:val="en-US"/>
+        </w:rPr>
+        <w:t xml:space="preserve"> dove range &gt; 0 AND </w:t>
+      </w:r>
+      <w:proofErr w:type="gramStart"/>
+      <w:r>
+        <w:rPr>
+          <w:rFonts w:asciiTheme="minorHAnsi" w:hAnsiTheme="minorHAnsi" w:cstheme="minorHAnsi"/>
+          <w:lang w:val="en-US"/>
+        </w:rPr>
+        <w:t>mode !</w:t>
+      </w:r>
+      <w:proofErr w:type="gramEnd"/>
+      <w:r>
+        <w:rPr>
+          <w:rFonts w:asciiTheme="minorHAnsi" w:hAnsiTheme="minorHAnsi" w:cstheme="minorHAnsi"/>
+          <w:lang w:val="en-US"/>
+        </w:rPr>
+        <w:t xml:space="preserve">= </w:t>
+      </w:r>
+      <w:r>
+        <w:rPr>
+          <w:rFonts w:asciiTheme="minorHAnsi" w:hAnsiTheme="minorHAnsi" w:cstheme="minorHAnsi"/>
+        </w:rPr>
+        <w:t>'NONE')</w:t>
       </w:r>
     </w:p>
     <w:p>
@@ -7858,12 +7859,14 @@
         </w:numPr>
         <w:rPr>
           <w:rFonts w:asciiTheme="minorHAnsi" w:hAnsiTheme="minorHAnsi" w:cstheme="minorHAnsi"/>
+          <w:lang w:val="en-US"/>
         </w:rPr>
       </w:pPr>
       <w:proofErr w:type="spellStart"/>
       <w:r>
         <w:rPr>
           <w:rFonts w:asciiTheme="minorHAnsi" w:hAnsiTheme="minorHAnsi" w:cstheme="minorHAnsi"/>
+          <w:lang w:val="en-US"/>
         </w:rPr>
         <w:t>USBLLONG_Loss</w:t>
       </w:r>
@@ -7871,6 +7874,7 @@
       <w:r>
         <w:rPr>
           <w:rFonts w:asciiTheme="minorHAnsi" w:hAnsiTheme="minorHAnsi" w:cstheme="minorHAnsi"/>
+          <w:lang w:val="en-US"/>
         </w:rPr>
         <w:t xml:space="preserve"> = (1 - </w:t>
       </w:r>
@@ -7878,6 +7882,7 @@
       <w:r>
         <w:rPr>
           <w:rFonts w:asciiTheme="minorHAnsi" w:hAnsiTheme="minorHAnsi" w:cstheme="minorHAnsi"/>
+          <w:lang w:val="en-US"/>
         </w:rPr>
         <w:t>USBLLONG_Validi</w:t>
       </w:r>
@@ -7885,6 +7890,7 @@
       <w:r>
         <w:rPr>
           <w:rFonts w:asciiTheme="minorHAnsi" w:hAnsiTheme="minorHAnsi" w:cstheme="minorHAnsi"/>
+          <w:lang w:val="en-US"/>
         </w:rPr>
         <w:t xml:space="preserve"> / </w:t>
       </w:r>
@@ -7892,6 +7898,7 @@
       <w:r>
         <w:rPr>
           <w:rFonts w:asciiTheme="minorHAnsi" w:hAnsiTheme="minorHAnsi" w:cstheme="minorHAnsi"/>
+          <w:lang w:val="en-US"/>
         </w:rPr>
         <w:t>Fix_Attesi</w:t>
       </w:r>
@@ -7899,6 +7906,7 @@
       <w:r>
         <w:rPr>
           <w:rFonts w:asciiTheme="minorHAnsi" w:hAnsiTheme="minorHAnsi" w:cstheme="minorHAnsi"/>
+          <w:lang w:val="en-US"/>
         </w:rPr>
         <w:t>) × 100%</w:t>
       </w:r>
@@ -7907,6 +7915,7 @@
       <w:pPr>
         <w:rPr>
           <w:rFonts w:asciiTheme="minorHAnsi" w:hAnsiTheme="minorHAnsi" w:cstheme="minorHAnsi"/>
+          <w:lang w:val="en-US"/>
         </w:rPr>
       </w:pPr>
     </w:p>
@@ -8044,7 +8053,13 @@
         <w:rPr>
           <w:rFonts w:asciiTheme="minorHAnsi" w:eastAsia="Calibri" w:hAnsiTheme="minorHAnsi" w:cstheme="minorHAnsi"/>
         </w:rPr>
-        <w:t>Architettura EKF</w:t>
+        <w:t>Architettura EK</w:t>
+      </w:r>
+      <w:r>
+        <w:rPr>
+          <w:rFonts w:asciiTheme="minorHAnsi" w:eastAsia="Calibri" w:hAnsiTheme="minorHAnsi" w:cstheme="minorHAnsi"/>
+        </w:rPr>
+        <w:t>F</w:t>
       </w:r>
     </w:p>
     <w:p>
@@ -8626,10 +8641,351 @@
           <w:color w:val="CCCCCC"/>
           <w:sz w:val="21"/>
           <w:szCs w:val="21"/>
-          <w:lang w:eastAsia="it-IT"/>
-        </w:rPr>
-      </w:pPr>
-      <w:r>
+          <w:lang w:val="en-US" w:eastAsia="it-IT"/>
+        </w:rPr>
+      </w:pPr>
+      <w:proofErr w:type="gramStart"/>
+      <w:r>
+        <w:rPr>
+          <w:rFonts w:ascii="Consolas" w:eastAsia="Times New Roman" w:hAnsi="Consolas"/>
+          <w:color w:val="CCCCCC"/>
+          <w:sz w:val="21"/>
+          <w:szCs w:val="21"/>
+          <w:lang w:val="en-US" w:eastAsia="it-IT"/>
+        </w:rPr>
+        <w:t xml:space="preserve">│  predict()   </w:t>
+      </w:r>
+      <w:proofErr w:type="spellStart"/>
+      <w:proofErr w:type="gramEnd"/>
+      <w:r>
+        <w:rPr>
+          <w:rFonts w:ascii="Consolas" w:eastAsia="Times New Roman" w:hAnsi="Consolas"/>
+          <w:color w:val="CCCCCC"/>
+          <w:sz w:val="21"/>
+          <w:szCs w:val="21"/>
+          <w:lang w:val="en-US" w:eastAsia="it-IT"/>
+        </w:rPr>
+        <w:t>update_</w:t>
+      </w:r>
+      <w:proofErr w:type="gramStart"/>
+      <w:r>
+        <w:rPr>
+          <w:rFonts w:ascii="Consolas" w:eastAsia="Times New Roman" w:hAnsi="Consolas"/>
+          <w:color w:val="CCCCCC"/>
+          <w:sz w:val="21"/>
+          <w:szCs w:val="21"/>
+          <w:lang w:val="en-US" w:eastAsia="it-IT"/>
+        </w:rPr>
+        <w:t>usbl</w:t>
+      </w:r>
+      <w:proofErr w:type="spellEnd"/>
+      <w:r>
+        <w:rPr>
+          <w:rFonts w:ascii="Consolas" w:eastAsia="Times New Roman" w:hAnsi="Consolas"/>
+          <w:color w:val="CCCCCC"/>
+          <w:sz w:val="21"/>
+          <w:szCs w:val="21"/>
+          <w:lang w:val="en-US" w:eastAsia="it-IT"/>
+        </w:rPr>
+        <w:t>()  </w:t>
+      </w:r>
+      <w:proofErr w:type="spellStart"/>
+      <w:r>
+        <w:rPr>
+          <w:rFonts w:ascii="Consolas" w:eastAsia="Times New Roman" w:hAnsi="Consolas"/>
+          <w:color w:val="CCCCCC"/>
+          <w:sz w:val="21"/>
+          <w:szCs w:val="21"/>
+          <w:lang w:val="en-US" w:eastAsia="it-IT"/>
+        </w:rPr>
+        <w:t>update</w:t>
+      </w:r>
+      <w:proofErr w:type="gramEnd"/>
+      <w:r>
+        <w:rPr>
+          <w:rFonts w:ascii="Consolas" w:eastAsia="Times New Roman" w:hAnsi="Consolas"/>
+          <w:color w:val="CCCCCC"/>
+          <w:sz w:val="21"/>
+          <w:szCs w:val="21"/>
+          <w:lang w:val="en-US" w:eastAsia="it-IT"/>
+        </w:rPr>
+        <w:t>_</w:t>
+      </w:r>
+      <w:proofErr w:type="gramStart"/>
+      <w:r>
+        <w:rPr>
+          <w:rFonts w:ascii="Consolas" w:eastAsia="Times New Roman" w:hAnsi="Consolas"/>
+          <w:color w:val="CCCCCC"/>
+          <w:sz w:val="21"/>
+          <w:szCs w:val="21"/>
+          <w:lang w:val="en-US" w:eastAsia="it-IT"/>
+        </w:rPr>
+        <w:t>depth</w:t>
+      </w:r>
+      <w:proofErr w:type="spellEnd"/>
+      <w:r>
+        <w:rPr>
+          <w:rFonts w:ascii="Consolas" w:eastAsia="Times New Roman" w:hAnsi="Consolas"/>
+          <w:color w:val="CCCCCC"/>
+          <w:sz w:val="21"/>
+          <w:szCs w:val="21"/>
+          <w:lang w:val="en-US" w:eastAsia="it-IT"/>
+        </w:rPr>
+        <w:t>(</w:t>
+      </w:r>
+      <w:proofErr w:type="gramEnd"/>
+      <w:r>
+        <w:rPr>
+          <w:rFonts w:ascii="Consolas" w:eastAsia="Times New Roman" w:hAnsi="Consolas"/>
+          <w:color w:val="CCCCCC"/>
+          <w:sz w:val="21"/>
+          <w:szCs w:val="21"/>
+          <w:lang w:val="en-US" w:eastAsia="it-IT"/>
+        </w:rPr>
+        <w:t>)                      │</w:t>
+      </w:r>
+    </w:p>
+    <w:p>
+      <w:pPr>
+        <w:shd w:val="clear" w:color="auto" w:fill="1F1F1F"/>
+        <w:spacing w:after="0" w:line="285" w:lineRule="atLeast"/>
+        <w:rPr>
+          <w:rFonts w:ascii="Consolas" w:eastAsia="Times New Roman" w:hAnsi="Consolas"/>
+          <w:color w:val="CCCCCC"/>
+          <w:sz w:val="21"/>
+          <w:szCs w:val="21"/>
+          <w:lang w:val="en-US" w:eastAsia="it-IT"/>
+        </w:rPr>
+      </w:pPr>
+      <w:r>
+        <w:rPr>
+          <w:rFonts w:ascii="Consolas" w:eastAsia="Times New Roman" w:hAnsi="Consolas"/>
+          <w:color w:val="CCCCCC"/>
+          <w:sz w:val="21"/>
+          <w:szCs w:val="21"/>
+          <w:lang w:val="en-US" w:eastAsia="it-IT"/>
+        </w:rPr>
+        <w:t>│</w:t>
+      </w:r>
+      <w:proofErr w:type="gramStart"/>
+      <w:r>
+        <w:rPr>
+          <w:rFonts w:ascii="Consolas" w:eastAsia="Times New Roman" w:hAnsi="Consolas"/>
+          <w:color w:val="CCCCCC"/>
+          <w:sz w:val="21"/>
+          <w:szCs w:val="21"/>
+          <w:lang w:val="en-US" w:eastAsia="it-IT"/>
+        </w:rPr>
+        <w:t xml:space="preserve">   (IMU)   </w:t>
+      </w:r>
+      <w:proofErr w:type="gramEnd"/>
+      <w:r>
+        <w:rPr>
+          <w:rFonts w:ascii="Consolas" w:eastAsia="Times New Roman" w:hAnsi="Consolas"/>
+          <w:color w:val="CCCCCC"/>
+          <w:sz w:val="21"/>
+          <w:szCs w:val="21"/>
+          <w:lang w:val="en-US" w:eastAsia="it-IT"/>
+        </w:rPr>
+        <w:t> </w:t>
+      </w:r>
+      <w:proofErr w:type="gramStart"/>
+      <w:r>
+        <w:rPr>
+          <w:rFonts w:ascii="Consolas" w:eastAsia="Times New Roman" w:hAnsi="Consolas"/>
+          <w:color w:val="CCCCCC"/>
+          <w:sz w:val="21"/>
+          <w:szCs w:val="21"/>
+          <w:lang w:val="en-US" w:eastAsia="it-IT"/>
+        </w:rPr>
+        <w:t xml:space="preserve">   (Range)   </w:t>
+      </w:r>
+      <w:proofErr w:type="gramEnd"/>
+      <w:r>
+        <w:rPr>
+          <w:rFonts w:ascii="Consolas" w:eastAsia="Times New Roman" w:hAnsi="Consolas"/>
+          <w:color w:val="CCCCCC"/>
+          <w:sz w:val="21"/>
+          <w:szCs w:val="21"/>
+          <w:lang w:val="en-US" w:eastAsia="it-IT"/>
+        </w:rPr>
+        <w:t xml:space="preserve">  </w:t>
+      </w:r>
+      <w:proofErr w:type="gramStart"/>
+      <w:r>
+        <w:rPr>
+          <w:rFonts w:ascii="Consolas" w:eastAsia="Times New Roman" w:hAnsi="Consolas"/>
+          <w:color w:val="CCCCCC"/>
+          <w:sz w:val="21"/>
+          <w:szCs w:val="21"/>
+          <w:lang w:val="en-US" w:eastAsia="it-IT"/>
+        </w:rPr>
+        <w:t>   (</w:t>
+      </w:r>
+      <w:proofErr w:type="gramEnd"/>
+      <w:r>
+        <w:rPr>
+          <w:rFonts w:ascii="Consolas" w:eastAsia="Times New Roman" w:hAnsi="Consolas"/>
+          <w:color w:val="CCCCCC"/>
+          <w:sz w:val="21"/>
+          <w:szCs w:val="21"/>
+          <w:lang w:val="en-US" w:eastAsia="it-IT"/>
+        </w:rPr>
+        <w:t xml:space="preserve">Asse </w:t>
+      </w:r>
+      <w:proofErr w:type="gramStart"/>
+      <w:r>
+        <w:rPr>
+          <w:rFonts w:ascii="Consolas" w:eastAsia="Times New Roman" w:hAnsi="Consolas"/>
+          <w:color w:val="CCCCCC"/>
+          <w:sz w:val="21"/>
+          <w:szCs w:val="21"/>
+          <w:lang w:val="en-US" w:eastAsia="it-IT"/>
+        </w:rPr>
+        <w:t xml:space="preserve">Z)   </w:t>
+      </w:r>
+      <w:proofErr w:type="gramEnd"/>
+      <w:r>
+        <w:rPr>
+          <w:rFonts w:ascii="Consolas" w:eastAsia="Times New Roman" w:hAnsi="Consolas"/>
+          <w:color w:val="CCCCCC"/>
+          <w:sz w:val="21"/>
+          <w:szCs w:val="21"/>
+          <w:lang w:val="en-US" w:eastAsia="it-IT"/>
+        </w:rPr>
+        <w:t>                        │</w:t>
+      </w:r>
+    </w:p>
+    <w:p>
+      <w:pPr>
+        <w:shd w:val="clear" w:color="auto" w:fill="1F1F1F"/>
+        <w:spacing w:after="0" w:line="285" w:lineRule="atLeast"/>
+        <w:rPr>
+          <w:rFonts w:ascii="Consolas" w:eastAsia="Times New Roman" w:hAnsi="Consolas"/>
+          <w:color w:val="CCCCCC"/>
+          <w:sz w:val="21"/>
+          <w:szCs w:val="21"/>
+          <w:lang w:val="en-US" w:eastAsia="it-IT"/>
+        </w:rPr>
+      </w:pPr>
+      <w:r>
+        <w:rPr>
+          <w:rFonts w:ascii="Consolas" w:eastAsia="Times New Roman" w:hAnsi="Consolas"/>
+          <w:color w:val="CCCCCC"/>
+          <w:sz w:val="21"/>
+          <w:szCs w:val="21"/>
+          <w:lang w:val="en-US" w:eastAsia="it-IT"/>
+        </w:rPr>
+        <w:t>│                   │                                             │</w:t>
+      </w:r>
+    </w:p>
+    <w:p>
+      <w:pPr>
+        <w:shd w:val="clear" w:color="auto" w:fill="1F1F1F"/>
+        <w:spacing w:after="0" w:line="285" w:lineRule="atLeast"/>
+        <w:rPr>
+          <w:rFonts w:ascii="Consolas" w:eastAsia="Times New Roman" w:hAnsi="Consolas"/>
+          <w:color w:val="CCCCCC"/>
+          <w:sz w:val="21"/>
+          <w:szCs w:val="21"/>
+          <w:lang w:val="en-US" w:eastAsia="it-IT"/>
+        </w:rPr>
+      </w:pPr>
+      <w:r>
+        <w:rPr>
+          <w:rFonts w:ascii="Consolas" w:eastAsia="Times New Roman" w:hAnsi="Consolas"/>
+          <w:color w:val="CCCCCC"/>
+          <w:sz w:val="21"/>
+          <w:szCs w:val="21"/>
+          <w:lang w:val="en-US" w:eastAsia="it-IT"/>
+        </w:rPr>
+        <w:t>│                   ▼                                             │</w:t>
+      </w:r>
+    </w:p>
+    <w:p>
+      <w:pPr>
+        <w:shd w:val="clear" w:color="auto" w:fill="1F1F1F"/>
+        <w:spacing w:after="0" w:line="285" w:lineRule="atLeast"/>
+        <w:rPr>
+          <w:rFonts w:ascii="Consolas" w:eastAsia="Times New Roman" w:hAnsi="Consolas"/>
+          <w:color w:val="CCCCCC"/>
+          <w:sz w:val="21"/>
+          <w:szCs w:val="21"/>
+          <w:lang w:val="en-US" w:eastAsia="it-IT"/>
+        </w:rPr>
+      </w:pPr>
+      <w:r>
+        <w:rPr>
+          <w:rFonts w:ascii="Consolas" w:eastAsia="Times New Roman" w:hAnsi="Consolas"/>
+          <w:color w:val="CCCCCC"/>
+          <w:sz w:val="21"/>
+          <w:szCs w:val="21"/>
+          <w:lang w:val="en-US" w:eastAsia="it-IT"/>
+        </w:rPr>
+        <w:t>│           ┌────────────────┐                                    │</w:t>
+      </w:r>
+    </w:p>
+    <w:p>
+      <w:pPr>
+        <w:shd w:val="clear" w:color="auto" w:fill="1F1F1F"/>
+        <w:spacing w:after="0" w:line="285" w:lineRule="atLeast"/>
+        <w:rPr>
+          <w:rFonts w:ascii="Consolas" w:eastAsia="Times New Roman" w:hAnsi="Consolas"/>
+          <w:color w:val="CCCCCC"/>
+          <w:sz w:val="21"/>
+          <w:szCs w:val="21"/>
+          <w:lang w:val="en-US" w:eastAsia="it-IT"/>
+        </w:rPr>
+      </w:pPr>
+      <w:r>
+        <w:rPr>
+          <w:rFonts w:ascii="Consolas" w:eastAsia="Times New Roman" w:hAnsi="Consolas"/>
+          <w:color w:val="CCCCCC"/>
+          <w:sz w:val="21"/>
+          <w:szCs w:val="21"/>
+          <w:lang w:val="en-US" w:eastAsia="it-IT"/>
+        </w:rPr>
+        <w:t xml:space="preserve">│           </w:t>
+      </w:r>
+      <w:proofErr w:type="gramStart"/>
+      <w:r>
+        <w:rPr>
+          <w:rFonts w:ascii="Consolas" w:eastAsia="Times New Roman" w:hAnsi="Consolas"/>
+          <w:color w:val="CCCCCC"/>
+          <w:sz w:val="21"/>
+          <w:szCs w:val="21"/>
+          <w:lang w:val="en-US" w:eastAsia="it-IT"/>
+        </w:rPr>
+        <w:t>│  </w:t>
+      </w:r>
+      <w:proofErr w:type="spellStart"/>
+      <w:r>
+        <w:rPr>
+          <w:rFonts w:ascii="Consolas" w:eastAsia="Times New Roman" w:hAnsi="Consolas"/>
+          <w:color w:val="CCCCCC"/>
+          <w:sz w:val="21"/>
+          <w:szCs w:val="21"/>
+          <w:lang w:val="en-US" w:eastAsia="it-IT"/>
+        </w:rPr>
+        <w:t>Traiettoria</w:t>
+      </w:r>
+      <w:proofErr w:type="spellEnd"/>
+      <w:proofErr w:type="gramEnd"/>
+      <w:r>
+        <w:rPr>
+          <w:rFonts w:ascii="Consolas" w:eastAsia="Times New Roman" w:hAnsi="Consolas"/>
+          <w:color w:val="CCCCCC"/>
+          <w:sz w:val="21"/>
+          <w:szCs w:val="21"/>
+          <w:lang w:val="en-US" w:eastAsia="it-IT"/>
+        </w:rPr>
+        <w:t xml:space="preserve">   │                                    │</w:t>
+      </w:r>
+    </w:p>
+    <w:p>
+      <w:pPr>
+        <w:shd w:val="clear" w:color="auto" w:fill="1F1F1F"/>
+        <w:spacing w:after="0" w:line="285" w:lineRule="atLeast"/>
         <w:rPr>
           <w:rFonts w:ascii="Consolas" w:eastAsia="Times New Roman" w:hAnsi="Consolas"/>
           <w:color w:val="CCCCCC"/>
@@ -8637,9 +8993,7 @@
           <w:szCs w:val="21"/>
           <w:lang w:eastAsia="it-IT"/>
         </w:rPr>
-        <w:t>│  </w:t>
-      </w:r>
-      <w:proofErr w:type="spellStart"/>
+      </w:pPr>
       <w:r>
         <w:rPr>
           <w:rFonts w:ascii="Consolas" w:eastAsia="Times New Roman" w:hAnsi="Consolas"/>
@@ -8648,10 +9002,13 @@
           <w:szCs w:val="21"/>
           <w:lang w:eastAsia="it-IT"/>
         </w:rPr>
-        <w:t>predict</w:t>
-      </w:r>
-      <w:proofErr w:type="spellEnd"/>
-      <w:r>
+        <w:t>│           │  + Covarianza P│                                    │</w:t>
+      </w:r>
+    </w:p>
+    <w:p>
+      <w:pPr>
+        <w:shd w:val="clear" w:color="auto" w:fill="1F1F1F"/>
+        <w:spacing w:after="0" w:line="285" w:lineRule="atLeast"/>
         <w:rPr>
           <w:rFonts w:ascii="Consolas" w:eastAsia="Times New Roman" w:hAnsi="Consolas"/>
           <w:color w:val="CCCCCC"/>
@@ -8659,9 +9016,7 @@
           <w:szCs w:val="21"/>
           <w:lang w:eastAsia="it-IT"/>
         </w:rPr>
-        <w:t xml:space="preserve">()   </w:t>
-      </w:r>
-      <w:proofErr w:type="spellStart"/>
+      </w:pPr>
       <w:r>
         <w:rPr>
           <w:rFonts w:ascii="Consolas" w:eastAsia="Times New Roman" w:hAnsi="Consolas"/>
@@ -8670,10 +9025,13 @@
           <w:szCs w:val="21"/>
           <w:lang w:eastAsia="it-IT"/>
         </w:rPr>
-        <w:t>update_usbl</w:t>
-      </w:r>
-      <w:proofErr w:type="spellEnd"/>
-      <w:r>
+        <w:t>│           └────────────────┘                                    │</w:t>
+      </w:r>
+    </w:p>
+    <w:p>
+      <w:pPr>
+        <w:shd w:val="clear" w:color="auto" w:fill="1F1F1F"/>
+        <w:spacing w:after="0" w:line="285" w:lineRule="atLeast"/>
         <w:rPr>
           <w:rFonts w:ascii="Consolas" w:eastAsia="Times New Roman" w:hAnsi="Consolas"/>
           <w:color w:val="CCCCCC"/>
@@ -8681,9 +9039,7 @@
           <w:szCs w:val="21"/>
           <w:lang w:eastAsia="it-IT"/>
         </w:rPr>
-        <w:t>()  </w:t>
-      </w:r>
-      <w:proofErr w:type="spellStart"/>
+      </w:pPr>
       <w:r>
         <w:rPr>
           <w:rFonts w:ascii="Consolas" w:eastAsia="Times New Roman" w:hAnsi="Consolas"/>
@@ -8692,10 +9048,13 @@
           <w:szCs w:val="21"/>
           <w:lang w:eastAsia="it-IT"/>
         </w:rPr>
-        <w:t>update_depth</w:t>
-      </w:r>
-      <w:proofErr w:type="spellEnd"/>
-      <w:r>
+        <w:t>└─────────────────────────────────────────────────────────────────┘</w:t>
+      </w:r>
+    </w:p>
+    <w:p>
+      <w:pPr>
+        <w:shd w:val="clear" w:color="auto" w:fill="1F1F1F"/>
+        <w:spacing w:after="0" w:line="285" w:lineRule="atLeast"/>
         <w:rPr>
           <w:rFonts w:ascii="Consolas" w:eastAsia="Times New Roman" w:hAnsi="Consolas"/>
           <w:color w:val="CCCCCC"/>
@@ -8703,13 +9062,8 @@
           <w:szCs w:val="21"/>
           <w:lang w:eastAsia="it-IT"/>
         </w:rPr>
-        <w:t>()                      │</w:t>
-      </w:r>
-    </w:p>
-    <w:p>
-      <w:pPr>
-        <w:shd w:val="clear" w:color="auto" w:fill="1F1F1F"/>
-        <w:spacing w:after="0" w:line="285" w:lineRule="atLeast"/>
+      </w:pPr>
+      <w:r>
         <w:rPr>
           <w:rFonts w:ascii="Consolas" w:eastAsia="Times New Roman" w:hAnsi="Consolas"/>
           <w:color w:val="CCCCCC"/>
@@ -8717,199 +9071,6 @@
           <w:szCs w:val="21"/>
           <w:lang w:eastAsia="it-IT"/>
         </w:rPr>
-      </w:pPr>
-      <w:r>
-        <w:rPr>
-          <w:rFonts w:ascii="Consolas" w:eastAsia="Times New Roman" w:hAnsi="Consolas"/>
-          <w:color w:val="CCCCCC"/>
-          <w:sz w:val="21"/>
-          <w:szCs w:val="21"/>
-          <w:lang w:eastAsia="it-IT"/>
-        </w:rPr>
-        <w:t>│   (IMU)       (Range)        (Asse Z)                           │</w:t>
-      </w:r>
-    </w:p>
-    <w:p>
-      <w:pPr>
-        <w:shd w:val="clear" w:color="auto" w:fill="1F1F1F"/>
-        <w:spacing w:after="0" w:line="285" w:lineRule="atLeast"/>
-        <w:rPr>
-          <w:rFonts w:ascii="Consolas" w:eastAsia="Times New Roman" w:hAnsi="Consolas"/>
-          <w:color w:val="CCCCCC"/>
-          <w:sz w:val="21"/>
-          <w:szCs w:val="21"/>
-          <w:lang w:eastAsia="it-IT"/>
-        </w:rPr>
-      </w:pPr>
-      <w:r>
-        <w:rPr>
-          <w:rFonts w:ascii="Consolas" w:eastAsia="Times New Roman" w:hAnsi="Consolas"/>
-          <w:color w:val="CCCCCC"/>
-          <w:sz w:val="21"/>
-          <w:szCs w:val="21"/>
-          <w:lang w:eastAsia="it-IT"/>
-        </w:rPr>
-        <w:t>│                   │                                             │</w:t>
-      </w:r>
-    </w:p>
-    <w:p>
-      <w:pPr>
-        <w:shd w:val="clear" w:color="auto" w:fill="1F1F1F"/>
-        <w:spacing w:after="0" w:line="285" w:lineRule="atLeast"/>
-        <w:rPr>
-          <w:rFonts w:ascii="Consolas" w:eastAsia="Times New Roman" w:hAnsi="Consolas"/>
-          <w:color w:val="CCCCCC"/>
-          <w:sz w:val="21"/>
-          <w:szCs w:val="21"/>
-          <w:lang w:eastAsia="it-IT"/>
-        </w:rPr>
-      </w:pPr>
-      <w:r>
-        <w:rPr>
-          <w:rFonts w:ascii="Consolas" w:eastAsia="Times New Roman" w:hAnsi="Consolas"/>
-          <w:color w:val="CCCCCC"/>
-          <w:sz w:val="21"/>
-          <w:szCs w:val="21"/>
-          <w:lang w:eastAsia="it-IT"/>
-        </w:rPr>
-        <w:t>│                   ▼                                             │</w:t>
-      </w:r>
-    </w:p>
-    <w:p>
-      <w:pPr>
-        <w:shd w:val="clear" w:color="auto" w:fill="1F1F1F"/>
-        <w:spacing w:after="0" w:line="285" w:lineRule="atLeast"/>
-        <w:rPr>
-          <w:rFonts w:ascii="Consolas" w:eastAsia="Times New Roman" w:hAnsi="Consolas"/>
-          <w:color w:val="CCCCCC"/>
-          <w:sz w:val="21"/>
-          <w:szCs w:val="21"/>
-          <w:lang w:eastAsia="it-IT"/>
-        </w:rPr>
-      </w:pPr>
-      <w:r>
-        <w:rPr>
-          <w:rFonts w:ascii="Consolas" w:eastAsia="Times New Roman" w:hAnsi="Consolas"/>
-          <w:color w:val="CCCCCC"/>
-          <w:sz w:val="21"/>
-          <w:szCs w:val="21"/>
-          <w:lang w:eastAsia="it-IT"/>
-        </w:rPr>
-        <w:t>│           ┌────────────────┐                                    │</w:t>
-      </w:r>
-    </w:p>
-    <w:p>
-      <w:pPr>
-        <w:shd w:val="clear" w:color="auto" w:fill="1F1F1F"/>
-        <w:spacing w:after="0" w:line="285" w:lineRule="atLeast"/>
-        <w:rPr>
-          <w:rFonts w:ascii="Consolas" w:eastAsia="Times New Roman" w:hAnsi="Consolas"/>
-          <w:color w:val="CCCCCC"/>
-          <w:sz w:val="21"/>
-          <w:szCs w:val="21"/>
-          <w:lang w:eastAsia="it-IT"/>
-        </w:rPr>
-      </w:pPr>
-      <w:r>
-        <w:rPr>
-          <w:rFonts w:ascii="Consolas" w:eastAsia="Times New Roman" w:hAnsi="Consolas"/>
-          <w:color w:val="CCCCCC"/>
-          <w:sz w:val="21"/>
-          <w:szCs w:val="21"/>
-          <w:lang w:eastAsia="it-IT"/>
-        </w:rPr>
-        <w:t>│           │  Traiettoria   │                                    │</w:t>
-      </w:r>
-    </w:p>
-    <w:p>
-      <w:pPr>
-        <w:shd w:val="clear" w:color="auto" w:fill="1F1F1F"/>
-        <w:spacing w:after="0" w:line="285" w:lineRule="atLeast"/>
-        <w:rPr>
-          <w:rFonts w:ascii="Consolas" w:eastAsia="Times New Roman" w:hAnsi="Consolas"/>
-          <w:color w:val="CCCCCC"/>
-          <w:sz w:val="21"/>
-          <w:szCs w:val="21"/>
-          <w:lang w:eastAsia="it-IT"/>
-        </w:rPr>
-      </w:pPr>
-      <w:r>
-        <w:rPr>
-          <w:rFonts w:ascii="Consolas" w:eastAsia="Times New Roman" w:hAnsi="Consolas"/>
-          <w:color w:val="CCCCCC"/>
-          <w:sz w:val="21"/>
-          <w:szCs w:val="21"/>
-          <w:lang w:eastAsia="it-IT"/>
-        </w:rPr>
-        <w:t>│           │  + Covarianza P│                                    │</w:t>
-      </w:r>
-    </w:p>
-    <w:p>
-      <w:pPr>
-        <w:shd w:val="clear" w:color="auto" w:fill="1F1F1F"/>
-        <w:spacing w:after="0" w:line="285" w:lineRule="atLeast"/>
-        <w:rPr>
-          <w:rFonts w:ascii="Consolas" w:eastAsia="Times New Roman" w:hAnsi="Consolas"/>
-          <w:color w:val="CCCCCC"/>
-          <w:sz w:val="21"/>
-          <w:szCs w:val="21"/>
-          <w:lang w:eastAsia="it-IT"/>
-        </w:rPr>
-      </w:pPr>
-      <w:r>
-        <w:rPr>
-          <w:rFonts w:ascii="Consolas" w:eastAsia="Times New Roman" w:hAnsi="Consolas"/>
-          <w:color w:val="CCCCCC"/>
-          <w:sz w:val="21"/>
-          <w:szCs w:val="21"/>
-          <w:lang w:eastAsia="it-IT"/>
-        </w:rPr>
-        <w:t>│           └────────────────┘                                    │</w:t>
-      </w:r>
-    </w:p>
-    <w:p>
-      <w:pPr>
-        <w:shd w:val="clear" w:color="auto" w:fill="1F1F1F"/>
-        <w:spacing w:after="0" w:line="285" w:lineRule="atLeast"/>
-        <w:rPr>
-          <w:rFonts w:ascii="Consolas" w:eastAsia="Times New Roman" w:hAnsi="Consolas"/>
-          <w:color w:val="CCCCCC"/>
-          <w:sz w:val="21"/>
-          <w:szCs w:val="21"/>
-          <w:lang w:eastAsia="it-IT"/>
-        </w:rPr>
-      </w:pPr>
-      <w:r>
-        <w:rPr>
-          <w:rFonts w:ascii="Consolas" w:eastAsia="Times New Roman" w:hAnsi="Consolas"/>
-          <w:color w:val="CCCCCC"/>
-          <w:sz w:val="21"/>
-          <w:szCs w:val="21"/>
-          <w:lang w:eastAsia="it-IT"/>
-        </w:rPr>
-        <w:t>└─────────────────────────────────────────────────────────────────┘</w:t>
-      </w:r>
-    </w:p>
-    <w:p>
-      <w:pPr>
-        <w:shd w:val="clear" w:color="auto" w:fill="1F1F1F"/>
-        <w:spacing w:after="0" w:line="285" w:lineRule="atLeast"/>
-        <w:rPr>
-          <w:rFonts w:ascii="Consolas" w:eastAsia="Times New Roman" w:hAnsi="Consolas"/>
-          <w:color w:val="CCCCCC"/>
-          <w:sz w:val="21"/>
-          <w:szCs w:val="21"/>
-          <w:lang w:eastAsia="it-IT"/>
-        </w:rPr>
-      </w:pPr>
-      <w:r>
-        <w:rPr>
-          <w:rFonts w:ascii="Consolas" w:eastAsia="Times New Roman" w:hAnsi="Consolas"/>
-          <w:color w:val="CCCCCC"/>
-          <w:sz w:val="21"/>
-          <w:szCs w:val="21"/>
-          <w:lang w:eastAsia="it-IT"/>
-        </w:rPr>
         <w:t>```</w:t>
       </w:r>
     </w:p>
@@ -8959,27 +9120,15 @@
         </w:numPr>
         <w:rPr>
           <w:rFonts w:asciiTheme="minorHAnsi" w:hAnsiTheme="minorHAnsi" w:cstheme="minorHAnsi"/>
-        </w:rPr>
-      </w:pPr>
-      <w:r>
-        <w:rPr>
-          <w:rFonts w:asciiTheme="minorHAnsi" w:hAnsiTheme="minorHAnsi" w:cstheme="minorHAnsi"/>
-        </w:rPr>
-        <w:t>Script: `</w:t>
-      </w:r>
-      <w:proofErr w:type="spellStart"/>
-      <w:r>
-        <w:rPr>
-          <w:rFonts w:asciiTheme="minorHAnsi" w:hAnsiTheme="minorHAnsi" w:cstheme="minorHAnsi"/>
-        </w:rPr>
-        <w:t>utils</w:t>
-      </w:r>
-      <w:proofErr w:type="spellEnd"/>
-      <w:r>
-        <w:rPr>
-          <w:rFonts w:asciiTheme="minorHAnsi" w:hAnsiTheme="minorHAnsi" w:cstheme="minorHAnsi"/>
-        </w:rPr>
-        <w:t>/ekf_sensor_fusion.py`</w:t>
+          <w:lang w:val="en-US"/>
+        </w:rPr>
+      </w:pPr>
+      <w:r>
+        <w:rPr>
+          <w:rFonts w:asciiTheme="minorHAnsi" w:hAnsiTheme="minorHAnsi" w:cstheme="minorHAnsi"/>
+          <w:lang w:val="en-US"/>
+        </w:rPr>
+        <w:t>Script: `utils/ekf_sensor_fusion.py`</w:t>
       </w:r>
     </w:p>
     <w:p>
@@ -9385,27 +9534,15 @@
         </w:numPr>
         <w:rPr>
           <w:rFonts w:asciiTheme="minorHAnsi" w:hAnsiTheme="minorHAnsi" w:cstheme="minorHAnsi"/>
-        </w:rPr>
-      </w:pPr>
-      <w:r>
-        <w:rPr>
-          <w:rFonts w:asciiTheme="minorHAnsi" w:hAnsiTheme="minorHAnsi" w:cstheme="minorHAnsi"/>
-        </w:rPr>
-        <w:t>Script: `</w:t>
-      </w:r>
-      <w:proofErr w:type="spellStart"/>
-      <w:r>
-        <w:rPr>
-          <w:rFonts w:asciiTheme="minorHAnsi" w:hAnsiTheme="minorHAnsi" w:cstheme="minorHAnsi"/>
-        </w:rPr>
-        <w:t>utils</w:t>
-      </w:r>
-      <w:proofErr w:type="spellEnd"/>
-      <w:r>
-        <w:rPr>
-          <w:rFonts w:asciiTheme="minorHAnsi" w:hAnsiTheme="minorHAnsi" w:cstheme="minorHAnsi"/>
-        </w:rPr>
-        <w:t>/ekf_sensor_fusion.py`</w:t>
+          <w:lang w:val="en-US"/>
+        </w:rPr>
+      </w:pPr>
+      <w:r>
+        <w:rPr>
+          <w:rFonts w:asciiTheme="minorHAnsi" w:hAnsiTheme="minorHAnsi" w:cstheme="minorHAnsi"/>
+          <w:lang w:val="en-US"/>
+        </w:rPr>
+        <w:t>Script: `utils/ekf_sensor_fusion.py`</w:t>
       </w:r>
     </w:p>
     <w:p>
@@ -10817,25 +10954,45 @@
               <w:cnfStyle w:val="000000100000" w:firstRow="0" w:lastRow="0" w:firstColumn="0" w:lastColumn="0" w:oddVBand="0" w:evenVBand="0" w:oddHBand="1" w:evenHBand="0" w:firstRowFirstColumn="0" w:firstRowLastColumn="0" w:lastRowFirstColumn="0" w:lastRowLastColumn="0"/>
               <w:rPr>
                 <w:rFonts w:asciiTheme="minorHAnsi" w:hAnsiTheme="minorHAnsi" w:cstheme="minorHAnsi"/>
+                <w:lang w:val="en-US"/>
               </w:rPr>
             </w:pPr>
             <w:proofErr w:type="spellStart"/>
             <w:r>
               <w:rPr>
                 <w:rFonts w:asciiTheme="minorHAnsi" w:hAnsiTheme="minorHAnsi" w:cstheme="minorHAnsi"/>
-              </w:rPr>
-              <w:t>UM_PB_Discharge_Rate</w:t>
+                <w:lang w:val="en-US"/>
+              </w:rPr>
+              <w:t>UM_PB_Discharge_</w:t>
+            </w:r>
+            <w:proofErr w:type="gramStart"/>
+            <w:r>
+              <w:rPr>
+                <w:rFonts w:asciiTheme="minorHAnsi" w:hAnsiTheme="minorHAnsi" w:cstheme="minorHAnsi"/>
+                <w:lang w:val="en-US"/>
+              </w:rPr>
+              <w:t>Rate</w:t>
             </w:r>
             <w:proofErr w:type="spellEnd"/>
             <w:r>
               <w:rPr>
                 <w:rFonts w:asciiTheme="minorHAnsi" w:hAnsiTheme="minorHAnsi" w:cstheme="minorHAnsi"/>
-              </w:rPr>
-              <w:t xml:space="preserve">  = </w:t>
+                <w:lang w:val="en-US"/>
+              </w:rPr>
+              <w:t xml:space="preserve">  =</w:t>
+            </w:r>
+            <w:proofErr w:type="gramEnd"/>
+            <w:r>
+              <w:rPr>
+                <w:rFonts w:asciiTheme="minorHAnsi" w:hAnsiTheme="minorHAnsi" w:cstheme="minorHAnsi"/>
+                <w:lang w:val="en-US"/>
+              </w:rPr>
+              <w:t xml:space="preserve"> </w:t>
             </w:r>
             <w:r>
               <w:rPr>
                 <w:rFonts w:asciiTheme="minorHAnsi" w:hAnsiTheme="minorHAnsi" w:cstheme="minorHAnsi"/>
+                <w:lang w:val="en-US"/>
               </w:rPr>
               <w:t>4%/</w:t>
             </w:r>
@@ -10843,6 +11000,7 @@
             <w:r>
               <w:rPr>
                 <w:rFonts w:asciiTheme="minorHAnsi" w:hAnsiTheme="minorHAnsi" w:cstheme="minorHAnsi"/>
+                <w:lang w:val="en-US"/>
               </w:rPr>
               <w:t>hr</w:t>
             </w:r>
@@ -27964,10 +28122,21 @@
 </file>
 
 <file path=customXml/item1.xml><?xml version="1.0" encoding="utf-8"?>
-<b:Sources xmlns:b="http://schemas.openxmlformats.org/officeDocument/2006/bibliography" xmlns="http://schemas.openxmlformats.org/officeDocument/2006/bibliography" SelectedStyle="\APASixthEditionOfficeOnline.xsl" StyleName="APA" Version="6"/>
+<?mso-contentType ?>
+<FormTemplates xmlns="http://schemas.microsoft.com/sharepoint/v3/contenttype/forms">
+  <Display>DocumentLibraryForm</Display>
+  <Edit>DocumentLibraryForm</Edit>
+  <New>DocumentLibraryForm</New>
+</FormTemplates>
 </file>
 
 <file path=customXml/item2.xml><?xml version="1.0" encoding="utf-8"?>
+<p:properties xmlns:p="http://schemas.microsoft.com/office/2006/metadata/properties" xmlns:xsi="http://www.w3.org/2001/XMLSchema-instance" xmlns:pc="http://schemas.microsoft.com/office/infopath/2007/PartnerControls">
+  <documentManagement/>
+</p:properties>
+</file>
+
+<file path=customXml/item3.xml><?xml version="1.0" encoding="utf-8"?>
 <ct:contentTypeSchema xmlns:ct="http://schemas.microsoft.com/office/2006/metadata/contentType" xmlns:ma="http://schemas.microsoft.com/office/2006/metadata/properties/metaAttributes" ct:_="" ma:_="" ma:contentTypeName="Documento" ma:contentTypeID="0x010100B719FDD54AE4444B9C66315FFAA4862A" ma:contentTypeVersion="3" ma:contentTypeDescription="Creare un nuovo documento." ma:contentTypeScope="" ma:versionID="effcd2cc53b5889a161daa9de6001e14">
   <xsd:schema xmlns:xsd="http://www.w3.org/2001/XMLSchema" xmlns:xs="http://www.w3.org/2001/XMLSchema" xmlns:p="http://schemas.microsoft.com/office/2006/metadata/properties" xmlns:ns2="3ed4378f-1279-4c8d-838e-a31ea6dee4e1" targetNamespace="http://schemas.microsoft.com/office/2006/metadata/properties" ma:root="true" ma:fieldsID="3ad4bacdc2fd9bfd13c809448737129d" ns2:_="">
     <xsd:import namespace="3ed4378f-1279-4c8d-838e-a31ea6dee4e1"/>
@@ -28105,30 +28274,28 @@
 </ct:contentTypeSchema>
 </file>
 
-<file path=customXml/item3.xml><?xml version="1.0" encoding="utf-8"?>
-<p:properties xmlns:p="http://schemas.microsoft.com/office/2006/metadata/properties" xmlns:xsi="http://www.w3.org/2001/XMLSchema-instance" xmlns:pc="http://schemas.microsoft.com/office/infopath/2007/PartnerControls">
-  <documentManagement/>
-</p:properties>
-</file>
-
 <file path=customXml/item4.xml><?xml version="1.0" encoding="utf-8"?>
-<?mso-contentType ?>
-<FormTemplates xmlns="http://schemas.microsoft.com/sharepoint/v3/contenttype/forms">
-  <Display>DocumentLibraryForm</Display>
-  <Edit>DocumentLibraryForm</Edit>
-  <New>DocumentLibraryForm</New>
-</FormTemplates>
+<b:Sources xmlns:b="http://schemas.openxmlformats.org/officeDocument/2006/bibliography" xmlns="http://schemas.openxmlformats.org/officeDocument/2006/bibliography" SelectedStyle="\APASixthEditionOfficeOnline.xsl" StyleName="APA" Version="6"/>
 </file>
 
 <file path=customXml/itemProps1.xml><?xml version="1.0" encoding="utf-8"?>
-<ds:datastoreItem xmlns:ds="http://schemas.openxmlformats.org/officeDocument/2006/customXml" ds:itemID="{C0649622-2550-4579-A871-BF789DBE52A1}">
+<ds:datastoreItem xmlns:ds="http://schemas.openxmlformats.org/officeDocument/2006/customXml" ds:itemID="{64E3AEBE-2E84-483A-8587-62FE5002D806}">
   <ds:schemaRefs>
-    <ds:schemaRef ds:uri="http://schemas.openxmlformats.org/officeDocument/2006/bibliography"/>
+    <ds:schemaRef ds:uri="http://schemas.microsoft.com/sharepoint/v3/contenttype/forms"/>
   </ds:schemaRefs>
 </ds:datastoreItem>
 </file>
 
 <file path=customXml/itemProps2.xml><?xml version="1.0" encoding="utf-8"?>
+<ds:datastoreItem xmlns:ds="http://schemas.openxmlformats.org/officeDocument/2006/customXml" ds:itemID="{DED93B78-2368-4096-998B-E4B6C71B1420}">
+  <ds:schemaRefs>
+    <ds:schemaRef ds:uri="http://schemas.microsoft.com/office/2006/metadata/properties"/>
+    <ds:schemaRef ds:uri="http://schemas.microsoft.com/office/infopath/2007/PartnerControls"/>
+  </ds:schemaRefs>
+</ds:datastoreItem>
+</file>
+
+<file path=customXml/itemProps3.xml><?xml version="1.0" encoding="utf-8"?>
 <ds:datastoreItem xmlns:ds="http://schemas.openxmlformats.org/officeDocument/2006/customXml" ds:itemID="{30CCA40F-FE5F-402E-B4E2-C29F786E3CF4}">
   <ds:schemaRefs>
     <ds:schemaRef ds:uri="http://schemas.microsoft.com/office/2006/metadata/contentType"/>
@@ -28146,19 +28313,10 @@
 </ds:datastoreItem>
 </file>
 
-<file path=customXml/itemProps3.xml><?xml version="1.0" encoding="utf-8"?>
-<ds:datastoreItem xmlns:ds="http://schemas.openxmlformats.org/officeDocument/2006/customXml" ds:itemID="{DED93B78-2368-4096-998B-E4B6C71B1420}">
+<file path=customXml/itemProps4.xml><?xml version="1.0" encoding="utf-8"?>
+<ds:datastoreItem xmlns:ds="http://schemas.openxmlformats.org/officeDocument/2006/customXml" ds:itemID="{C0649622-2550-4579-A871-BF789DBE52A1}">
   <ds:schemaRefs>
-    <ds:schemaRef ds:uri="http://schemas.microsoft.com/office/2006/metadata/properties"/>
-    <ds:schemaRef ds:uri="http://schemas.microsoft.com/office/infopath/2007/PartnerControls"/>
-  </ds:schemaRefs>
-</ds:datastoreItem>
-</file>
-
-<file path=customXml/itemProps4.xml><?xml version="1.0" encoding="utf-8"?>
-<ds:datastoreItem xmlns:ds="http://schemas.openxmlformats.org/officeDocument/2006/customXml" ds:itemID="{64E3AEBE-2E84-483A-8587-62FE5002D806}">
-  <ds:schemaRefs>
-    <ds:schemaRef ds:uri="http://schemas.microsoft.com/sharepoint/v3/contenttype/forms"/>
+    <ds:schemaRef ds:uri="http://schemas.openxmlformats.org/officeDocument/2006/bibliography"/>
   </ds:schemaRefs>
 </ds:datastoreItem>
 </file>
</xml_diff>